<commit_message>
Mémoire : rapporter le kappa (§ 4.2.6) et sa limite (§ 6.4)
Paragraphe « Fidélité du codage » : part du corpus recodée (3 entretiens
sur 20 par un pair, 3 recodés à quatre semaines), kappa de Cohen par
paragraphe (inter- et intra-codeur), interprétation selon Landis et Koch
(référence ajoutée, vérifiée dans PubMed), désaccords tranchés en
consensus. Limite en 6.4 : kappa favorisé par les paragraphes non codés.
Rapport : même précision dans le tableau des méthodes. Mémoire : 70 pages.

Co-Authored-By: Claude Opus 5.5 <noreply@anthropic.com>
Claude-Session: https://claude.ai/code/session_01HxwPseJn9EZbm4HRSeCoVh
</commit_message>
<xml_diff>
--- a/memoire-ngoma/livrables/Chapitre_6_Discussion.docx
+++ b/memoire-ngoma/livrables/Chapitre_6_Discussion.docx
@@ -1942,7 +1942,7 @@
           <w:sz w:val="22"/>
           <w:szCs w:val="22"/>
         </w:rPr>
-        <w:t xml:space="preserve"> ; la fidélité du codage a été contrôlée (κ = 0,869 ; intra-codeur κ = 0,958) ; la rigueur répond aux critères retenus</w:t>
+        <w:t xml:space="preserve"> ; la fidélité du codage a été contrôlée (§ 4.2.6) ; la rigueur répond aux critères retenus</w:t>
       </w:r>
       <w:r>
         <w:rPr>
@@ -1989,7 +1989,7 @@
           <w:sz w:val="22"/>
           <w:szCs w:val="22"/>
         </w:rPr>
-        <w:t xml:space="preserve">Limites. Les résultats portent sur des pratiques déclarées et des représentations professionnelles ; le point de vue des femmes reste hors champ. Les entretiens n'ayant pas été enregistrés, les extraits sont des propos notés : leur formulation exacte n'est pas garantie, ce que la vérification des interprétations auprès des participants atténue. L'observation est exposée à un effet de présence</w:t>
+        <w:t xml:space="preserve">Limites. Les résultats portent sur des pratiques déclarées et des représentations professionnelles ; le point de vue des femmes reste hors champ. Les entretiens n'ayant pas été enregistrés, les extraits sont des propos notés, dont la formulation exacte n'est pas garantie. L'observation est exposée à un effet de présence</w:t>
       </w:r>
       <w:r>
         <w:rPr>
@@ -2021,7 +2021,23 @@
           <w:sz w:val="22"/>
           <w:szCs w:val="22"/>
         </w:rPr>
-        <w:t xml:space="preserve">, et l'étude, limitée à un district, ne se généralise pas. Les perspectives et suggestions sont présentées en conclusion.</w:t>
+        <w:t xml:space="preserve">, l'étude, limitée à un district, ne se généralise pas, et le kappa</w:t>
+      </w:r>
+      <w:r>
+        <w:rPr>
+          <w:sz w:val="22"/>
+          <w:szCs w:val="22"/>
+        </w:rPr>
+        <w:t xml:space="preserve"> [92]</w:t>
+      </w:r>
+      <w:r>
+        <w:rPr>
+          <w:i w:val="false"/>
+          <w:iCs w:val="false"/>
+          <w:sz w:val="22"/>
+          <w:szCs w:val="22"/>
+        </w:rPr>
+        <w:t xml:space="preserve">, calculé par paragraphe, est favorisé par les paragraphes qu'aucun codeur ne code : il atteste la cohérence de la grille, non la justesse de l'interprétation.</w:t>
       </w:r>
     </w:p>
     <w:p>
@@ -2291,6 +2307,19 @@
           <w:szCs w:val="20"/>
         </w:rPr>
         <w:t xml:space="preserve">91.	McCambridge J, Witton J, Elbourne DR. Systematic review of the Hawthorne effect: new concepts are needed to study research participation effects. J Clin Epidemiol. 2014;67(3):267-77.</w:t>
+      </w:r>
+    </w:p>
+    <w:p>
+      <w:pPr>
+        <w:spacing w:after="80"/>
+        <w:ind w:left="567" w:hanging="567"/>
+      </w:pPr>
+      <w:r>
+        <w:rPr>
+          <w:sz w:val="20"/>
+          <w:szCs w:val="20"/>
+        </w:rPr>
+        <w:t xml:space="preserve">92.	Landis JR, Koch GG. The measurement of observer agreement for categorical data. Biometrics. 1977;33(1):159-74.</w:t>
       </w:r>
     </w:p>
     <w:sectPr>

</xml_diff>

<commit_message>
Figure 3 et § 6.3 accordés au tableau VIII (quatre révisions du cadre)
La figure 3 marque aussi la pratique informative (séance collective
distinguée de la restitution du résultat) et complète l'articulation
communautaire (ASM, alerte téléphonique, umugoroba w'ababyeyi) ; la
légende de la cascade ne déborde plus de son cadre. Le § 6.3 annonce
quatre révisions, comme le tableau VIII, et le mémo « Piste d'audit »
du projet QualiCode les reprend.

Co-Authored-By: Claude Opus 5.5 <noreply@anthropic.com>
Claude-Session: https://claude.ai/code/session_01HxwPseJn9EZbm4HRSeCoVh
</commit_message>
<xml_diff>
--- a/memoire-ngoma/livrables/Chapitre_6_Discussion.docx
+++ b/memoire-ngoma/livrables/Chapitre_6_Discussion.docx
@@ -1356,7 +1356,7 @@
           <w:sz w:val="22"/>
           <w:szCs w:val="22"/>
         </w:rPr>
-        <w:t xml:space="preserve">Sur les 88 codes de l'arbre final, 41 sont nés du matériau. Ils ne remettent pas en cause les deux ensembles du cadre, mais appellent trois révisions (tableau VIII), que la figure 3 intègre : une cascade d'accès à la glycémie au niveau organisationnel, que le modèle socio-écologique</w:t>
+        <w:t xml:space="preserve">Sur les 88 codes de l'arbre final, 41 sont nés du matériau. Ils ne remettent pas en cause les deux ensembles du cadre, mais appellent quatre révisions (tableau VIII), que la figure 3 intègre : une cascade d'accès à la glycémie au niveau organisationnel, que le modèle socio-écologique</w:t>
       </w:r>
       <w:r>
         <w:rPr>
@@ -1372,7 +1372,7 @@
           <w:sz w:val="22"/>
           <w:szCs w:val="22"/>
         </w:rPr>
-        <w:t xml:space="preserve"> ne laissait pas voir ; le dispositif de contrôle comme condition systémique ; une articulation communautaire ; et trois dimensions de l'équité d'accès — au test, à l'explication, à la continuité.</w:t>
+        <w:t xml:space="preserve"> ne laissait pas voir ; dans la pratique informative, la distinction entre la séance d'éducation collective et la restitution individuelle du résultat ; une articulation communautaire ; le dispositif de contrôle comme condition systémique. La figure décompose en outre l'équité d'accès en trois dimensions : au test, à l'explication, à la continuité.</w:t>
       </w:r>
     </w:p>
     <w:p>
@@ -1385,7 +1385,7 @@
       <w:r>
         <w:drawing>
           <wp:inline distT="0" distB="0" distL="0" distR="0">
-            <wp:extent cx="4953000" cy="7581900"/>
+            <wp:extent cx="4953000" cy="7696200"/>
             <wp:effectExtent t="0" r="0" b="0" l="0"/>
             <wp:docPr id="1" name="" descr="" title=""/>
             <wp:cNvGraphicFramePr>
@@ -1410,7 +1410,7 @@
                   <pic:spPr bwMode="auto">
                     <a:xfrm>
                       <a:off x="0" y="0"/>
-                      <a:ext cx="4953000" cy="7581900"/>
+                      <a:ext cx="4953000" cy="7696200"/>
                     </a:xfrm>
                     <a:prstGeom prst="rect">
                       <a:avLst/>

</xml_diff>

<commit_message>
Périmètre de la CPN : centres et postes de santé (Mulungi et al., 2023)
La phrase reprise du protocole (« la CPN n'est assurée qu'au niveau des
centres de santé ; les postes de santé n'en dispensent pas ») n'a pu être
confirmée. L'introduction et le § 4.1.2 disent désormais que la CPN de
base est offerte dans les centres et les postes de santé, et que l'étude
porte sur les centres de santé. Référence ajoutée, vérifiée en texte
intégral dans PubMed et citée aussi dans la discussion ; point ajouté à
la liste à vérifier (référence [21] inaccessible, 312 lits à confirmer).

Co-Authored-By: Claude Opus 5.5 <noreply@anthropic.com>
Claude-Session: https://claude.ai/code/session_01HxwPseJn9EZbm4HRSeCoVh
</commit_message>
<xml_diff>
--- a/memoire-ngoma/livrables/Chapitre_6_Discussion.docx
+++ b/memoire-ngoma/livrables/Chapitre_6_Discussion.docx
@@ -1244,6 +1244,22 @@
           <w:sz w:val="22"/>
           <w:szCs w:val="22"/>
         </w:rPr>
+        <w:t xml:space="preserve">, alors qu'à l'échelle nationale 41 % commencent la CPN après le premier trimestre</w:t>
+      </w:r>
+      <w:r>
+        <w:rPr>
+          <w:sz w:val="22"/>
+          <w:szCs w:val="22"/>
+        </w:rPr>
+        <w:t xml:space="preserve"> [89]</w:t>
+      </w:r>
+      <w:r>
+        <w:rPr>
+          <w:i w:val="false"/>
+          <w:iCs w:val="false"/>
+          <w:sz w:val="22"/>
+          <w:szCs w:val="22"/>
+        </w:rPr>
         <w:t xml:space="preserve"> ; les aides de l'ubudehe</w:t>
       </w:r>
       <w:r>
@@ -1251,7 +1267,7 @@
           <w:sz w:val="22"/>
           <w:szCs w:val="22"/>
         </w:rPr>
-        <w:t xml:space="preserve"> [61,62,89]</w:t>
+        <w:t xml:space="preserve"> [61,62,90]</w:t>
       </w:r>
       <w:r>
         <w:rPr>
@@ -1267,7 +1283,7 @@
           <w:sz w:val="22"/>
           <w:szCs w:val="22"/>
         </w:rPr>
-        <w:t xml:space="preserve"> [90]</w:t>
+        <w:t xml:space="preserve"> [91]</w:t>
       </w:r>
       <w:r>
         <w:rPr>
@@ -1283,7 +1299,7 @@
           <w:sz w:val="22"/>
           <w:szCs w:val="22"/>
         </w:rPr>
-        <w:t xml:space="preserve"> [91]</w:t>
+        <w:t xml:space="preserve"> [92]</w:t>
       </w:r>
       <w:r>
         <w:rPr>
@@ -1299,7 +1315,7 @@
           <w:sz w:val="22"/>
           <w:szCs w:val="22"/>
         </w:rPr>
-        <w:t xml:space="preserve"> [92]</w:t>
+        <w:t xml:space="preserve"> [93]</w:t>
       </w:r>
       <w:r>
         <w:rPr>
@@ -2028,7 +2044,7 @@
           <w:sz w:val="22"/>
           <w:szCs w:val="22"/>
         </w:rPr>
-        <w:t xml:space="preserve"> [93]</w:t>
+        <w:t xml:space="preserve"> [94]</w:t>
       </w:r>
       <w:r>
         <w:rPr>
@@ -2060,7 +2076,7 @@
           <w:sz w:val="22"/>
           <w:szCs w:val="22"/>
         </w:rPr>
-        <w:t xml:space="preserve"> [94]</w:t>
+        <w:t xml:space="preserve"> [95]</w:t>
       </w:r>
       <w:r>
         <w:rPr>
@@ -2312,7 +2328,7 @@
           <w:sz w:val="20"/>
           <w:szCs w:val="20"/>
         </w:rPr>
-        <w:t xml:space="preserve">89.	Rwanda Biomedical Centre. Shisha Kibondo : farine enrichie pour les femmes enceintes et allaitantes des ménages vulnérables [Internet]. Kigali: RBC; [cité le 3 oct 2026]. Disponible sur: https://rbc.gov.rw/wp/?p=7362</w:t>
+        <w:t xml:space="preserve">89.	Mulungi A, Mukamurigo J, Rwunganira S, Njunwa K, Ntaganira J. Prevalence and risk factors for delayed antenatal care visits in Rwanda: an analysis of secondary data from Rwanda demographic health survey 2019-2020. Pan Afr Med J. 2023;44:74. doi:10.11604/pamj.2023.44.74.37570</w:t>
       </w:r>
     </w:p>
     <w:p>
@@ -2325,7 +2341,7 @@
           <w:sz w:val="20"/>
           <w:szCs w:val="20"/>
         </w:rPr>
-        <w:t xml:space="preserve">90.	Ngabo F, Nguimfack J, Nwaigwe F, Mugeni C, Muhoza D, Wilson DR, et al. Designing and implementing an innovative SMS-based alert system (RapidSMS-MCH) to monitor pregnancy and reduce maternal and child deaths in Rwanda. Pan Afr Med J. 2012;13:31.</w:t>
+        <w:t xml:space="preserve">90.	Rwanda Biomedical Centre. Shisha Kibondo : farine enrichie pour les femmes enceintes et allaitantes des ménages vulnérables [Internet]. Kigali: RBC; [cité le 3 oct 2026]. Disponible sur: https://rbc.gov.rw/wp/?p=7362</w:t>
       </w:r>
     </w:p>
     <w:p>
@@ -2338,7 +2354,7 @@
           <w:sz w:val="20"/>
           <w:szCs w:val="20"/>
         </w:rPr>
-        <w:t xml:space="preserve">91.	Enabel, Be-cause health. Rwanda NCD mass campaign: results and lessons [Internet]. Bruxelles: Be-cause health; 2019 [cité le 3 oct 2026]. Disponible sur: https://www.be-causehealth.be/wp-content/uploads/2019/11/20191016-Rwanda-NCD-Mass-Campaign-results-lessons.pdf</w:t>
+        <w:t xml:space="preserve">91.	Ngabo F, Nguimfack J, Nwaigwe F, Mugeni C, Muhoza D, Wilson DR, et al. Designing and implementing an innovative SMS-based alert system (RapidSMS-MCH) to monitor pregnancy and reduce maternal and child deaths in Rwanda. Pan Afr Med J. 2012;13:31.</w:t>
       </w:r>
     </w:p>
     <w:p>
@@ -2351,7 +2367,7 @@
           <w:sz w:val="20"/>
           <w:szCs w:val="20"/>
         </w:rPr>
-        <w:t xml:space="preserve">92.	Nsanzabera F, Irakoze E, Manishimwe A, Nsengiyumva JB, Mwiseneza A, Ntakirutimana E, et al. Improving early childhood nutrition practices through parents' evening forums in rural Rwanda. Public Health Nutr. 2025;28(1):e136. doi:10.1017/S1368980025100803</w:t>
+        <w:t xml:space="preserve">92.	Enabel, Be-cause health. Rwanda NCD mass campaign: results and lessons [Internet]. Bruxelles: Be-cause health; 2019 [cité le 3 oct 2026]. Disponible sur: https://www.be-causehealth.be/wp-content/uploads/2019/11/20191016-Rwanda-NCD-Mass-Campaign-results-lessons.pdf</w:t>
       </w:r>
     </w:p>
     <w:p>
@@ -2364,7 +2380,7 @@
           <w:sz w:val="20"/>
           <w:szCs w:val="20"/>
         </w:rPr>
-        <w:t xml:space="preserve">93.	McCambridge J, Witton J, Elbourne DR. Systematic review of the Hawthorne effect: new concepts are needed to study research participation effects. J Clin Epidemiol. 2014;67(3):267-77.</w:t>
+        <w:t xml:space="preserve">93.	Nsanzabera F, Irakoze E, Manishimwe A, Nsengiyumva JB, Mwiseneza A, Ntakirutimana E, et al. Improving early childhood nutrition practices through parents' evening forums in rural Rwanda. Public Health Nutr. 2025;28(1):e136. doi:10.1017/S1368980025100803</w:t>
       </w:r>
     </w:p>
     <w:p>
@@ -2377,7 +2393,20 @@
           <w:sz w:val="20"/>
           <w:szCs w:val="20"/>
         </w:rPr>
-        <w:t xml:space="preserve">94.	Landis JR, Koch GG. The measurement of observer agreement for categorical data. Biometrics. 1977;33(1):159-74.</w:t>
+        <w:t xml:space="preserve">94.	McCambridge J, Witton J, Elbourne DR. Systematic review of the Hawthorne effect: new concepts are needed to study research participation effects. J Clin Epidemiol. 2014;67(3):267-77.</w:t>
+      </w:r>
+    </w:p>
+    <w:p>
+      <w:pPr>
+        <w:spacing w:after="80"/>
+        <w:ind w:left="567" w:hanging="567"/>
+      </w:pPr>
+      <w:r>
+        <w:rPr>
+          <w:sz w:val="20"/>
+          <w:szCs w:val="20"/>
+        </w:rPr>
+        <w:t xml:space="preserve">95.	Landis JR, Koch GG. The measurement of observer agreement for categorical data. Biometrics. 1977;33(1):159-74.</w:t>
       </w:r>
     </w:p>
     <w:sectPr>

</xml_diff>